<commit_message>
got the pictures in with the gird pattern sort of working
Also I really need to read the mdn word doc instructions more cafully, otherwise I wouldn't have been puzzled as to why It wouldn't pull the picture from the file containing the images when I named it to Pictures instead of, well images.
</commit_message>
<xml_diff>
--- a/Assigment 3/inft1206_assignment3V2.docx
+++ b/Assigment 3/inft1206_assignment3V2.docx
@@ -1179,7 +1179,25 @@
             <w:sz w:val="22"/>
             <w:shd w:val="clear" w:color="auto" w:fill="FFFFFF"/>
           </w:rPr>
-          <w:t>https://developer.mozilla.org/en-US/docs/Learn/CSS/CSS_layout/Fundamental_Layout_Comprehension</w:t>
+          <w:t>https://developer.mozilla.org/en-US/docs/Learn/</w:t>
+        </w:r>
+        <w:r>
+          <w:rPr>
+            <w:rStyle w:val="Hyperlink"/>
+            <w:rFonts w:ascii="Verdana" w:hAnsi="Verdana"/>
+            <w:sz w:val="22"/>
+            <w:shd w:val="clear" w:color="auto" w:fill="FFFFFF"/>
+          </w:rPr>
+          <w:t>C</w:t>
+        </w:r>
+        <w:r>
+          <w:rPr>
+            <w:rStyle w:val="Hyperlink"/>
+            <w:rFonts w:ascii="Verdana" w:hAnsi="Verdana"/>
+            <w:sz w:val="22"/>
+            <w:shd w:val="clear" w:color="auto" w:fill="FFFFFF"/>
+          </w:rPr>
+          <w:t>SS/CSS_layout/Fundamental_Layout_Comprehension</w:t>
         </w:r>
       </w:hyperlink>
       <w:r>

</xml_diff>